<commit_message>
Update Capturas de seguimiento de los reportes generados.docx
</commit_message>
<xml_diff>
--- a/Capturas de seguimiento de los reportes generados.docx
+++ b/Capturas de seguimiento de los reportes generados.docx
@@ -283,24 +283,40 @@
       </w:r>
     </w:p>
     <w:p/>
-    <w:p/>
-    <w:p/>
-    <w:p/>
-    <w:p/>
-    <w:p/>
-    <w:p/>
-    <w:p/>
-    <w:p/>
-    <w:p/>
-    <w:p/>
-    <w:p/>
-    <w:p/>
-    <w:p/>
-    <w:p/>
-    <w:p/>
     <w:p>
       <w:r>
-        <w:lastRenderedPageBreak/>
+        <w:t xml:space="preserve">Página del </w:t>
+      </w:r>
+      <w:proofErr w:type="spellStart"/>
+      <w:r>
+        <w:t>github</w:t>
+      </w:r>
+      <w:proofErr w:type="spellEnd"/>
+      <w:r>
+        <w:t xml:space="preserve"> del taller</w:t>
+      </w:r>
+    </w:p>
+    <w:p>
+      <w:r>
+        <w:t>https://github.com/alex3952/Taller_seccionA</w:t>
+      </w:r>
+    </w:p>
+    <w:p/>
+    <w:p/>
+    <w:p/>
+    <w:p/>
+    <w:p/>
+    <w:p/>
+    <w:p/>
+    <w:p/>
+    <w:p/>
+    <w:p/>
+    <w:p/>
+    <w:p/>
+    <w:p/>
+    <w:p/>
+    <w:p>
+      <w:r>
         <w:t>Después de corregir los errores quedó así</w:t>
       </w:r>
     </w:p>

</xml_diff>

<commit_message>
reporte pdf pegado aquí
</commit_message>
<xml_diff>
--- a/Capturas de seguimiento de los reportes generados.docx
+++ b/Capturas de seguimiento de los reportes generados.docx
@@ -19,6 +19,9 @@
     </w:p>
     <w:p>
       <w:r>
+        <w:rPr>
+          <w:noProof/>
+        </w:rPr>
         <w:drawing>
           <wp:inline distT="0" distB="0" distL="0" distR="0" wp14:anchorId="76EEFB5F" wp14:editId="49E0D595">
             <wp:extent cx="5943600" cy="2921635"/>
@@ -61,6 +64,9 @@
     <w:p/>
     <w:p>
       <w:r>
+        <w:rPr>
+          <w:noProof/>
+        </w:rPr>
         <w:drawing>
           <wp:inline distT="0" distB="0" distL="0" distR="0" wp14:anchorId="41098ECF" wp14:editId="261BB5B9">
             <wp:extent cx="4791075" cy="3328671"/>
@@ -106,6 +112,9 @@
     </w:p>
     <w:p>
       <w:r>
+        <w:rPr>
+          <w:noProof/>
+        </w:rPr>
         <w:drawing>
           <wp:inline distT="0" distB="0" distL="0" distR="0" wp14:anchorId="4E0D9064" wp14:editId="571393D1">
             <wp:extent cx="4238625" cy="3836499"/>
@@ -166,6 +175,9 @@
     <w:p/>
     <w:p>
       <w:r>
+        <w:rPr>
+          <w:noProof/>
+        </w:rPr>
         <w:drawing>
           <wp:inline distT="0" distB="0" distL="0" distR="0" wp14:anchorId="579D7827" wp14:editId="73AAFAC1">
             <wp:extent cx="5543550" cy="3653650"/>
@@ -205,6 +217,9 @@
     </w:p>
     <w:p>
       <w:r>
+        <w:rPr>
+          <w:noProof/>
+        </w:rPr>
         <w:drawing>
           <wp:inline distT="0" distB="0" distL="0" distR="0" wp14:anchorId="7AF46E74" wp14:editId="7D43A07E">
             <wp:extent cx="5086350" cy="3766942"/>
@@ -244,6 +259,9 @@
     </w:p>
     <w:p>
       <w:r>
+        <w:rPr>
+          <w:noProof/>
+        </w:rPr>
         <w:lastRenderedPageBreak/>
         <w:drawing>
           <wp:inline distT="0" distB="0" distL="0" distR="0" wp14:anchorId="7E208C25" wp14:editId="5467DC81">
@@ -283,45 +301,31 @@
       </w:r>
     </w:p>
     <w:p/>
+    <w:p/>
+    <w:p/>
+    <w:p/>
+    <w:p/>
+    <w:p/>
+    <w:p/>
+    <w:p/>
+    <w:p/>
+    <w:p/>
+    <w:p/>
+    <w:p/>
+    <w:p/>
+    <w:p/>
+    <w:p/>
     <w:p>
       <w:r>
-        <w:t xml:space="preserve">Página del </w:t>
-      </w:r>
-      <w:proofErr w:type="spellStart"/>
-      <w:r>
-        <w:t>github</w:t>
-      </w:r>
-      <w:proofErr w:type="spellEnd"/>
-      <w:r>
-        <w:t xml:space="preserve"> del taller</w:t>
+        <w:t>Después de corregir los errores quedó así</w:t>
       </w:r>
     </w:p>
     <w:p>
       <w:r>
-        <w:t>https://github.com/alex3952/Taller_seccionA</w:t>
-      </w:r>
-    </w:p>
-    <w:p/>
-    <w:p/>
-    <w:p/>
-    <w:p/>
-    <w:p/>
-    <w:p/>
-    <w:p/>
-    <w:p/>
-    <w:p/>
-    <w:p/>
-    <w:p/>
-    <w:p/>
-    <w:p/>
-    <w:p/>
-    <w:p>
-      <w:r>
-        <w:t>Después de corregir los errores quedó así</w:t>
-      </w:r>
-    </w:p>
-    <w:p>
-      <w:r>
+        <w:rPr>
+          <w:noProof/>
+        </w:rPr>
+        <w:lastRenderedPageBreak/>
         <w:drawing>
           <wp:inline distT="0" distB="0" distL="0" distR="0" wp14:anchorId="71B860C1" wp14:editId="34348CA5">
             <wp:extent cx="5943600" cy="3837305"/>
@@ -359,6 +363,9 @@
         </w:drawing>
       </w:r>
       <w:r>
+        <w:rPr>
+          <w:noProof/>
+        </w:rPr>
         <w:drawing>
           <wp:inline distT="0" distB="0" distL="0" distR="0" wp14:anchorId="6D165A37" wp14:editId="2909778E">
             <wp:extent cx="5314950" cy="3640968"/>
@@ -394,6 +401,24 @@
             </a:graphic>
           </wp:inline>
         </w:drawing>
+      </w:r>
+    </w:p>
+    <w:p>
+      <w:r>
+        <w:t xml:space="preserve">Página del </w:t>
+      </w:r>
+      <w:proofErr w:type="spellStart"/>
+      <w:r>
+        <w:t>github</w:t>
+      </w:r>
+      <w:proofErr w:type="spellEnd"/>
+      <w:r>
+        <w:t xml:space="preserve"> del taller</w:t>
+      </w:r>
+    </w:p>
+    <w:p>
+      <w:r>
+        <w:t>https://github.com/alex3952/Taller_seccionA</w:t>
       </w:r>
     </w:p>
     <w:sectPr>

</xml_diff>